<commit_message>
fix(templates): write the page fields without the format switch, so the editor numbers the pages
Claude-Session: https://claude.ai/code/session_01F1WgouFMHfd4n13ZWxgG8f
</commit_message>
<xml_diff>
--- a/packages/document-engine/templates/10_prevention_plan.docx
+++ b/packages/document-engine/templates/10_prevention_plan.docx
@@ -34273,7 +34273,7 @@
               <w:szCs w:val="16"/>
               <w:lang w:val="ro-RO"/>
             </w:rPr>
-            <w:instrText xml:space="preserve"> PAGE \* ARABIC </w:instrText>
+            <w:instrText xml:space="preserve"> PAGE </w:instrText>
           </w:r>
           <w:r>
             <w:rPr>
@@ -34357,7 +34357,7 @@
               <w:szCs w:val="16"/>
               <w:lang w:val="ro-RO"/>
             </w:rPr>
-            <w:instrText xml:space="preserve"> NUMPAGES \* ARABIC </w:instrText>
+            <w:instrText xml:space="preserve"> NUMPAGES </w:instrText>
           </w:r>
           <w:r>
             <w:rPr>
@@ -35056,7 +35056,7 @@
               <w:szCs w:val="16"/>
               <w:lang w:val="ro-RO"/>
             </w:rPr>
-            <w:instrText xml:space="preserve"> PAGE \* ARABIC </w:instrText>
+            <w:instrText xml:space="preserve"> PAGE </w:instrText>
           </w:r>
           <w:r>
             <w:rPr>
@@ -35140,7 +35140,7 @@
               <w:szCs w:val="16"/>
               <w:lang w:val="ro-RO"/>
             </w:rPr>
-            <w:instrText xml:space="preserve"> NUMPAGES \* ARABIC </w:instrText>
+            <w:instrText xml:space="preserve"> NUMPAGES </w:instrText>
           </w:r>
           <w:r>
             <w:rPr>
@@ -35839,7 +35839,7 @@
               <w:szCs w:val="16"/>
               <w:lang w:val="ro-RO"/>
             </w:rPr>
-            <w:instrText xml:space="preserve"> PAGE \* ARABIC </w:instrText>
+            <w:instrText xml:space="preserve"> PAGE </w:instrText>
           </w:r>
           <w:r>
             <w:rPr>
@@ -35923,7 +35923,7 @@
               <w:szCs w:val="16"/>
               <w:lang w:val="ro-RO"/>
             </w:rPr>
-            <w:instrText xml:space="preserve"> NUMPAGES \* ARABIC </w:instrText>
+            <w:instrText xml:space="preserve"> NUMPAGES </w:instrText>
           </w:r>
           <w:r>
             <w:rPr>

</xml_diff>

<commit_message>
fix(templates): a date line under each side of the prevention plan's hand-over block
Claude-Session: https://claude.ai/code/session_01A9qjCHVH6kcDAEKFiJoShR
</commit_message>
<xml_diff>
--- a/packages/document-engine/templates/10_prevention_plan.docx
+++ b/packages/document-engine/templates/10_prevention_plan.docx
@@ -170,6 +170,34 @@
               <w:t>{{provider.representativeRole}} al {{provider.legalName}}</w:t>
             </w:r>
           </w:p>
+          <w:p>
+            <w:pPr>
+              <w:pStyle w:val="TableContents"/>
+              <w:keepNext w:val="false"/>
+              <w:spacing w:before="240" w:after="0"/>
+              <w:ind w:hanging="0" w:left="0"/>
+              <w:jc w:val="center"/>
+              <w:rPr>
+                <w:rFonts w:ascii="Arial" w:hAnsi="Arial" w:eastAsia="Arial" w:cs="Arial"/>
+                <w:b w:val="false"/>
+                <w:i w:val="false"/>
+                <w:color w:val="auto"/>
+                <w:sz w:val="20"/>
+                <w:lang w:val="ro-RO"/>
+              </w:rPr>
+            </w:pPr>
+            <w:r>
+              <w:rPr>
+                <w:rFonts w:eastAsia="Arial" w:cs="Arial" w:ascii="Arial" w:hAnsi="Arial"/>
+                <w:b w:val="false"/>
+                <w:i w:val="false"/>
+                <w:color w:val="auto"/>
+                <w:sz w:val="20"/>
+                <w:lang w:val="ro-RO"/>
+              </w:rPr>
+              <w:t>Data: ______________</w:t>
+            </w:r>
+          </w:p>
         </w:tc>
         <w:tc>
           <w:tcPr>
@@ -286,6 +314,34 @@
                 <w:lang w:val="ro-RO"/>
               </w:rPr>
               <w:t>{{client.representativeRole}} al {{client.legalName}}</w:t>
+            </w:r>
+          </w:p>
+          <w:p>
+            <w:pPr>
+              <w:pStyle w:val="TableContents"/>
+              <w:keepNext w:val="false"/>
+              <w:spacing w:before="240" w:after="0"/>
+              <w:ind w:hanging="0" w:left="0"/>
+              <w:jc w:val="center"/>
+              <w:rPr>
+                <w:rFonts w:ascii="Arial" w:hAnsi="Arial" w:eastAsia="Arial" w:cs="Arial"/>
+                <w:b w:val="false"/>
+                <w:i w:val="false"/>
+                <w:color w:val="auto"/>
+                <w:sz w:val="20"/>
+                <w:lang w:val="ro-RO"/>
+              </w:rPr>
+            </w:pPr>
+            <w:r>
+              <w:rPr>
+                <w:rFonts w:eastAsia="Arial" w:cs="Arial" w:ascii="Arial" w:hAnsi="Arial"/>
+                <w:b w:val="false"/>
+                <w:i w:val="false"/>
+                <w:color w:val="auto"/>
+                <w:sz w:val="20"/>
+                <w:lang w:val="ro-RO"/>
+              </w:rPr>
+              <w:t>Data: ______________</w:t>
             </w:r>
           </w:p>
         </w:tc>

</xml_diff>

<commit_message>
fix(templates): a wider deadline column in the prevention plan
"Termen de realizare" grows from 950 to 1120 twips, taken evenly from
the four measure columns (now 1484 each), so a deadline such as "La
comunicarea stării de graviditate" no longer breaks mid-word.

Claude-Session: https://claude.ai/code/session_01A9qjCHVH6kcDAEKFiJoShR
</commit_message>
<xml_diff>
--- a/packages/document-engine/templates/10_prevention_plan.docx
+++ b/packages/document-engine/templates/10_prevention_plan.docx
@@ -483,12 +483,12 @@
       <w:tblGrid>
         <w:gridCol w:w="544"/>
         <w:gridCol w:w="2041"/>
-        <w:gridCol w:w="1527"/>
-        <w:gridCol w:w="1527"/>
-        <w:gridCol w:w="1526"/>
-        <w:gridCol w:w="1526"/>
+        <w:gridCol w:w="1484"/>
+        <w:gridCol w:w="1484"/>
+        <w:gridCol w:w="1484"/>
+        <w:gridCol w:w="1484"/>
         <w:gridCol w:w="1600"/>
-        <w:gridCol w:w="950"/>
+        <w:gridCol w:w="1120"/>
         <w:gridCol w:w="1458"/>
         <w:gridCol w:w="1588"/>
       </w:tblGrid>
@@ -591,7 +591,7 @@
         </w:tc>
         <w:tc>
           <w:tcPr>
-            <w:tcW w:w="1527" w:type="dxa"/>
+            <w:tcW w:w="1484" w:type="dxa"/>
             <w:tcBorders>
               <w:top w:val="single" w:sz="4" w:space="0" w:color="000000"/>
               <w:left w:val="single" w:sz="4" w:space="0" w:color="000000"/>
@@ -637,7 +637,7 @@
         </w:tc>
         <w:tc>
           <w:tcPr>
-            <w:tcW w:w="1527" w:type="dxa"/>
+            <w:tcW w:w="1484" w:type="dxa"/>
             <w:tcBorders>
               <w:top w:val="single" w:sz="4" w:space="0" w:color="000000"/>
               <w:left w:val="single" w:sz="4" w:space="0" w:color="000000"/>
@@ -683,7 +683,7 @@
         </w:tc>
         <w:tc>
           <w:tcPr>
-            <w:tcW w:w="1526" w:type="dxa"/>
+            <w:tcW w:w="1484" w:type="dxa"/>
             <w:tcBorders>
               <w:top w:val="single" w:sz="4" w:space="0" w:color="000000"/>
               <w:left w:val="single" w:sz="4" w:space="0" w:color="000000"/>
@@ -729,7 +729,7 @@
         </w:tc>
         <w:tc>
           <w:tcPr>
-            <w:tcW w:w="1526" w:type="dxa"/>
+            <w:tcW w:w="1484" w:type="dxa"/>
             <w:tcBorders>
               <w:top w:val="single" w:sz="4" w:space="0" w:color="000000"/>
               <w:left w:val="single" w:sz="4" w:space="0" w:color="000000"/>
@@ -821,7 +821,7 @@
         </w:tc>
         <w:tc>
           <w:tcPr>
-            <w:tcW w:w="950" w:type="dxa"/>
+            <w:tcW w:w="1120" w:type="dxa"/>
             <w:tcBorders>
               <w:top w:val="single" w:sz="4" w:space="0" w:color="000000"/>
               <w:left w:val="single" w:sz="4" w:space="0" w:color="000000"/>
@@ -1053,7 +1053,7 @@
         </w:tc>
         <w:tc>
           <w:tcPr>
-            <w:tcW w:w="1527" w:type="dxa"/>
+            <w:tcW w:w="1484" w:type="dxa"/>
             <w:tcBorders>
               <w:left w:val="single" w:sz="4" w:space="0" w:color="000000"/>
               <w:bottom w:val="single" w:sz="4" w:space="0" w:color="000000"/>
@@ -1097,7 +1097,7 @@
         </w:tc>
         <w:tc>
           <w:tcPr>
-            <w:tcW w:w="1527" w:type="dxa"/>
+            <w:tcW w:w="1484" w:type="dxa"/>
             <w:tcBorders>
               <w:left w:val="single" w:sz="4" w:space="0" w:color="000000"/>
               <w:bottom w:val="single" w:sz="4" w:space="0" w:color="000000"/>
@@ -1141,7 +1141,7 @@
         </w:tc>
         <w:tc>
           <w:tcPr>
-            <w:tcW w:w="1526" w:type="dxa"/>
+            <w:tcW w:w="1484" w:type="dxa"/>
             <w:tcBorders>
               <w:left w:val="single" w:sz="4" w:space="0" w:color="000000"/>
               <w:bottom w:val="single" w:sz="4" w:space="0" w:color="000000"/>
@@ -1185,7 +1185,7 @@
         </w:tc>
         <w:tc>
           <w:tcPr>
-            <w:tcW w:w="1526" w:type="dxa"/>
+            <w:tcW w:w="1484" w:type="dxa"/>
             <w:tcBorders>
               <w:left w:val="single" w:sz="4" w:space="0" w:color="000000"/>
               <w:bottom w:val="single" w:sz="4" w:space="0" w:color="000000"/>
@@ -1273,7 +1273,7 @@
         </w:tc>
         <w:tc>
           <w:tcPr>
-            <w:tcW w:w="950" w:type="dxa"/>
+            <w:tcW w:w="1120" w:type="dxa"/>
             <w:tcBorders>
               <w:left w:val="single" w:sz="4" w:space="0" w:color="000000"/>
               <w:bottom w:val="single" w:sz="4" w:space="0" w:color="000000"/>

</xml_diff>

<commit_message>
fix(documents): a client declares that it has no workers from the sensitive groups, or evaluates them; generation waits for one or the other (ADR 015)
The first version of this branch made the sensitive groups evaluation silently optional. The review asked for an explicit answer instead: `clients.sensitive_groups_state` is `undecided`, `none` by the member's declaration, or `evaluated` while the evaluation exists, kept by the database as the fire-safety substances are. The gap `risk_evaluations.sensitive_groups` is back, cleared by the declaration; the row on the positions page and the row of the generate form offer it beside «Evaluează»; documents 9 and 10 print the declaration.
</commit_message>
<xml_diff>
--- a/packages/document-engine/templates/10_prevention_plan.docx
+++ b/packages/document-engine/templates/10_prevention_plan.docx
@@ -347,6 +347,126 @@
         </w:tc>
       </w:tr>
     </w:tbl>
+    <w:p>
+      <w:pPr>
+        <w:pStyle w:val="Normal"/>
+        <w:keepNext w:val="false"/>
+        <w:pageBreakBefore w:val="false"/>
+        <w:widowControl/>
+        <w:numPr>
+          <w:ilvl w:val="0"/>
+          <w:numId w:val="0"/>
+        </w:numPr>
+        <w:spacing w:before="0" w:after="120"/>
+        <w:ind w:hanging="0" w:left="0"/>
+        <w:jc w:val="left"/>
+        <w:rPr>
+          <w:rFonts w:ascii="Arial" w:hAnsi="Arial" w:eastAsia="Arial" w:cs="Arial"/>
+          <w:b w:val="false"/>
+          <w:i w:val="false"/>
+          <w:color w:val="auto"/>
+          <w:spacing w:val="0"/>
+          <w:w w:val="100"/>
+          <w:sz w:val="20"/>
+          <w:szCs w:val="20"/>
+          <w:lang w:val="ro-RO"/>
+        </w:rPr>
+      </w:pPr>
+      <w:r>
+        <w:rPr>
+          <w:rFonts w:eastAsia="Arial" w:cs="Arial" w:ascii="Arial" w:hAnsi="Arial"/>
+          <w:b w:val="false"/>
+          <w:i w:val="false"/>
+          <w:color w:val="auto"/>
+          <w:spacing w:val="0"/>
+          <w:w w:val="100"/>
+          <w:sz w:val="20"/>
+          <w:szCs w:val="20"/>
+          <w:lang w:val="ro-RO"/>
+        </w:rPr>
+        <w:t xml:space="preserve">{{#riskAssessment.noSensitiveGroups}}</w:t>
+      </w:r>
+    </w:p>
+    <w:p>
+      <w:pPr>
+        <w:pStyle w:val="Normal"/>
+        <w:keepNext w:val="false"/>
+        <w:pageBreakBefore w:val="false"/>
+        <w:widowControl/>
+        <w:numPr>
+          <w:ilvl w:val="0"/>
+          <w:numId w:val="0"/>
+        </w:numPr>
+        <w:spacing w:before="0" w:after="120"/>
+        <w:ind w:hanging="0" w:left="0"/>
+        <w:jc w:val="left"/>
+        <w:rPr>
+          <w:rFonts w:ascii="Arial" w:hAnsi="Arial" w:eastAsia="Arial" w:cs="Arial"/>
+          <w:b w:val="false"/>
+          <w:i w:val="false"/>
+          <w:color w:val="auto"/>
+          <w:spacing w:val="0"/>
+          <w:w w:val="100"/>
+          <w:sz w:val="20"/>
+          <w:szCs w:val="20"/>
+          <w:lang w:val="ro-RO"/>
+        </w:rPr>
+      </w:pPr>
+      <w:r>
+        <w:rPr>
+          <w:rFonts w:eastAsia="Arial" w:cs="Arial" w:ascii="Arial" w:hAnsi="Arial"/>
+          <w:b w:val="false"/>
+          <w:i w:val="false"/>
+          <w:color w:val="auto"/>
+          <w:spacing w:val="0"/>
+          <w:w w:val="100"/>
+          <w:sz w:val="20"/>
+          <w:szCs w:val="20"/>
+          <w:lang w:val="ro-RO"/>
+        </w:rPr>
+        <w:t xml:space="preserve">{{client.legalName}} declară că nu are lucrători din grupurile sensibile la riscuri specifice (femei gravide, lăuze sau care alăptează, tineri, persoane cu dizabilități), astfel că planul nu cuprinde măsuri pentru aceste grupuri.</w:t>
+      </w:r>
+    </w:p>
+    <w:p>
+      <w:pPr>
+        <w:pStyle w:val="Normal"/>
+        <w:keepNext w:val="false"/>
+        <w:pageBreakBefore w:val="false"/>
+        <w:widowControl/>
+        <w:numPr>
+          <w:ilvl w:val="0"/>
+          <w:numId w:val="0"/>
+        </w:numPr>
+        <w:spacing w:before="0" w:after="120"/>
+        <w:ind w:hanging="0" w:left="0"/>
+        <w:jc w:val="left"/>
+        <w:rPr>
+          <w:rFonts w:ascii="Arial" w:hAnsi="Arial" w:eastAsia="Arial" w:cs="Arial"/>
+          <w:b w:val="false"/>
+          <w:i w:val="false"/>
+          <w:color w:val="auto"/>
+          <w:spacing w:val="0"/>
+          <w:w w:val="100"/>
+          <w:sz w:val="20"/>
+          <w:szCs w:val="20"/>
+          <w:lang w:val="ro-RO"/>
+        </w:rPr>
+      </w:pPr>
+      <w:r>
+        <w:rPr>
+          <w:rFonts w:eastAsia="Arial" w:cs="Arial" w:ascii="Arial" w:hAnsi="Arial"/>
+          <w:b w:val="false"/>
+          <w:i w:val="false"/>
+          <w:color w:val="auto"/>
+          <w:spacing w:val="0"/>
+          <w:w w:val="100"/>
+          <w:sz w:val="20"/>
+          <w:szCs w:val="20"/>
+          <w:lang w:val="ro-RO"/>
+        </w:rPr>
+        <w:t xml:space="preserve">{{/riskAssessment.noSensitiveGroups}}</w:t>
+      </w:r>
+    </w:p>
     <w:p>
       <w:pPr>
         <w:pStyle w:val="Normal"/>

</xml_diff>